<commit_message>
Match the deploy guide to what Neon's console actually prints
Neon names the unpooled string DATABASE_URL_UNPOOLED; this app calls it
DIRECT_URL. Copying Neon's variable name straight into Render leaves DIRECT_URL
unset and the API refuses to boot, so the guide now calls the mismatch out.

Also corrects the reasoning behind directUrl. Neon's own snippet says it is only
required on Prisma < 5.10 and this project is on 5.22, so the earlier claim that
migrations would fail without it was too strong. The recommendation stands —
it is what Prisma documents for a pooled database and it costs nothing — but the
guide now says why rather than overstating the risk.

Adds two troubleshooting rows: pasting the masked password without clicking
Show password, and Neon's channel_binding parameter.
</commit_message>
<xml_diff>
--- a/docs/word/DEPLOY.docx
+++ b/docs/word/DEPLOY.docx
@@ -228,7 +228,7 @@
         </w:rPr>
         <w:t xml:space="preserve">Sign up at </w:t>
       </w:r>
-      <w:hyperlink w:history="1" r:id="rIdp57dbbhzkdfy2ybl8fxo5">
+      <w:hyperlink w:history="1" r:id="rIdlugg17fgfcsepku3lnj0h">
         <w:r>
           <w:rPr>
             <w:rStyle w:val="Hyperlink"/>
@@ -380,7 +380,7 @@
           <w:sz w:val="21"/>
           <w:szCs w:val="21"/>
         </w:rPr>
-        <w:t xml:space="preserve">On the project dashboard find the </w:t>
+        <w:t xml:space="preserve">Hit </w:t>
       </w:r>
       <w:r>
         <w:rPr>
@@ -390,46 +390,15 @@
           <w:sz w:val="21"/>
           <w:szCs w:val="21"/>
         </w:rPr>
-        <w:t xml:space="preserve">connection string</w:t>
-      </w:r>
-      <w:r>
-        <w:rPr>
-          <w:color w:val="111827"/>
-          <w:sz w:val="21"/>
-          <w:szCs w:val="21"/>
-        </w:rPr>
-        <w:t xml:space="preserve"> panel and change the</w:t>
-      </w:r>
-    </w:p>
-    <w:p>
-      <w:pPr>
-        <w:spacing w:after="140" w:line="276"/>
-      </w:pPr>
-      <w:r>
-        <w:rPr>
-          <w:color w:val="111827"/>
-          <w:sz w:val="21"/>
-          <w:szCs w:val="21"/>
-        </w:rPr>
-        <w:t xml:space="preserve">dropdown from </w:t>
-      </w:r>
-      <w:r>
-        <w:rPr>
-          <w:i/>
-          <w:iCs/>
-          <w:color w:val="111827"/>
-          <w:sz w:val="21"/>
-          <w:szCs w:val="21"/>
-        </w:rPr>
-        <w:t xml:space="preserve">psql</w:t>
-      </w:r>
-      <w:r>
-        <w:rPr>
-          <w:color w:val="111827"/>
-          <w:sz w:val="21"/>
-          <w:szCs w:val="21"/>
-        </w:rPr>
-        <w:t xml:space="preserve"> to </w:t>
+        <w:t xml:space="preserve">Connect</w:t>
+      </w:r>
+      <w:r>
+        <w:rPr>
+          <w:color w:val="111827"/>
+          <w:sz w:val="21"/>
+          <w:szCs w:val="21"/>
+        </w:rPr>
+        <w:t xml:space="preserve">, set the framework dropdown to </w:t>
       </w:r>
       <w:r>
         <w:rPr>
@@ -447,7 +416,65 @@
           <w:sz w:val="21"/>
           <w:szCs w:val="21"/>
         </w:rPr>
-        <w:t xml:space="preserve">. Neon then prints exactly the two strings this app needs:</w:t>
+        <w:t xml:space="preserve">, leave</w:t>
+      </w:r>
+    </w:p>
+    <w:p>
+      <w:pPr>
+        <w:spacing w:after="140" w:line="276"/>
+      </w:pPr>
+      <w:r>
+        <w:rPr>
+          <w:b/>
+          <w:bCs/>
+          <w:color w:val="111827"/>
+          <w:sz w:val="21"/>
+          <w:szCs w:val="21"/>
+        </w:rPr>
+        <w:t xml:space="preserve">Connection pooling</w:t>
+      </w:r>
+      <w:r>
+        <w:rPr>
+          <w:color w:val="111827"/>
+          <w:sz w:val="21"/>
+          <w:szCs w:val="21"/>
+        </w:rPr>
+        <w:t xml:space="preserve"> on, and click </w:t>
+      </w:r>
+      <w:r>
+        <w:rPr>
+          <w:b/>
+          <w:bCs/>
+          <w:color w:val="111827"/>
+          <w:sz w:val="21"/>
+          <w:szCs w:val="21"/>
+        </w:rPr>
+        <w:t xml:space="preserve">Show password</w:t>
+      </w:r>
+      <w:r>
+        <w:rPr>
+          <w:color w:val="111827"/>
+          <w:sz w:val="21"/>
+          <w:szCs w:val="21"/>
+        </w:rPr>
+        <w:t xml:space="preserve">. Neon prints two strings, on the </w:t>
+      </w:r>
+      <w:r>
+        <w:rPr>
+          <w:rFonts w:ascii="Consolas" w:cs="Consolas" w:eastAsia="Consolas" w:hAnsi="Consolas"/>
+          <w:color w:val="111827"/>
+          <w:sz w:val="19"/>
+          <w:szCs w:val="19"/>
+        </w:rPr>
+        <w:t xml:space="preserve">.env</w:t>
+      </w:r>
+      <w:r>
+        <w:rPr>
+          <w:color w:val="111827"/>
+          <w:sz w:val="21"/>
+          <w:szCs w:val="21"/>
+        </w:rPr>
+        <w:t xml:space="preserve"> tab:</w:t>
       </w:r>
     </w:p>
     <w:p>
@@ -463,7 +490,7 @@
           <w:sz w:val="18"/>
           <w:szCs w:val="18"/>
         </w:rPr>
-        <w:t xml:space="preserve">   DATABASE_URL="postgresql://…@ep-xxx-pooler.eu-central-1.aws.neon.tech/…"</w:t>
+        <w:t xml:space="preserve">   DATABASE_URL="postgresql://…@ep-xxx-pooler.c-4.eu-central-1.aws.neon.tech/neondb?sslmode=require…"</w:t>
       </w:r>
     </w:p>
     <w:p>
@@ -479,20 +506,20 @@
           <w:sz w:val="18"/>
           <w:szCs w:val="18"/>
         </w:rPr>
-        <w:t xml:space="preserve">   DIRECT_URL="postgresql://…@ep-xxx.eu-central-1.aws.neon.tech/…"</w:t>
-      </w:r>
-    </w:p>
-    <w:p>
-      <w:pPr>
-        <w:spacing w:after="140" w:line="276"/>
-      </w:pPr>
-      <w:r>
-        <w:rPr>
-          <w:color w:val="111827"/>
-          <w:sz w:val="21"/>
-          <w:szCs w:val="21"/>
-        </w:rPr>
-        <w:t xml:space="preserve">Copy both somewhere for a minute. Note the difference: the first host has </w:t>
+        <w:t xml:space="preserve">   DATABASE_URL_UNPOOLED="postgresql://…@ep-xxx.c-4.eu-central-1.aws.neon.tech/neondb?sslmode=require…"</w:t>
+      </w:r>
+    </w:p>
+    <w:p>
+      <w:pPr>
+        <w:spacing w:after="140" w:line="276"/>
+      </w:pPr>
+      <w:r>
+        <w:rPr>
+          <w:color w:val="111827"/>
+          <w:sz w:val="21"/>
+          <w:szCs w:val="21"/>
+        </w:rPr>
+        <w:t xml:space="preserve">They are identical apart from </w:t>
       </w:r>
       <w:r>
         <w:rPr>
@@ -510,7 +537,7 @@
           <w:sz w:val="21"/>
           <w:szCs w:val="21"/>
         </w:rPr>
-        <w:t xml:space="preserve"> in it, the second does not.</w:t>
+        <w:t xml:space="preserve"> in the first host.</w:t>
       </w:r>
     </w:p>
     <w:p>
@@ -531,7 +558,7 @@
           <w:sz w:val="21"/>
           <w:szCs w:val="21"/>
         </w:rPr>
-        <w:t xml:space="preserve">Why two?</w:t>
+        <w:t xml:space="preserve">Watch the name.</w:t>
       </w:r>
       <w:r>
         <w:rPr>
@@ -541,26 +568,7 @@
           <w:sz w:val="21"/>
           <w:szCs w:val="21"/>
         </w:rPr>
-        <w:t xml:space="preserve"> The pooled one is for the running app — Neon's compute scales to</w:t>
-      </w:r>
-    </w:p>
-    <w:p>
-      <w:pPr>
-        <w:pBdr>
-          <w:left w:val="single" w:color="0F766E" w:sz="12" w:space="12"/>
-        </w:pBdr>
-        <w:spacing w:after="140" w:line="276"/>
-        <w:ind w:left="360"/>
-      </w:pPr>
-      <w:r>
-        <w:rPr>
-          <w:i/>
-          <w:iCs/>
-          <w:color w:val="6B7280"/>
-          <w:sz w:val="21"/>
-          <w:szCs w:val="21"/>
-        </w:rPr>
-        <w:t xml:space="preserve">zero when idle and the pooler handles waking it. </w:t>
+        <w:t xml:space="preserve"> Neon calls the second one </w:t>
       </w:r>
       <w:r>
         <w:rPr>
@@ -571,7 +579,7 @@
           <w:sz w:val="19"/>
           <w:szCs w:val="19"/>
         </w:rPr>
-        <w:t xml:space="preserve">prisma migrate</w:t>
+        <w:t xml:space="preserve">DATABASE_URL_UNPOOLED</w:t>
       </w:r>
       <w:r>
         <w:rPr>
@@ -581,7 +589,7 @@
           <w:sz w:val="21"/>
           <w:szCs w:val="21"/>
         </w:rPr>
-        <w:t xml:space="preserve"> cannot use</w:t>
+        <w:t xml:space="preserve">; this app</w:t>
       </w:r>
     </w:p>
     <w:p>
@@ -600,7 +608,29 @@
           <w:sz w:val="21"/>
           <w:szCs w:val="21"/>
         </w:rPr>
-        <w:t xml:space="preserve">it, because it takes advisory locks that do not survive transaction-mode</w:t>
+        <w:t xml:space="preserve">calls it </w:t>
+      </w:r>
+      <w:r>
+        <w:rPr>
+          <w:b/>
+          <w:bCs/>
+          <w:i/>
+          <w:iCs/>
+          <w:color w:val="6B7280"/>
+          <w:sz w:val="21"/>
+          <w:szCs w:val="21"/>
+        </w:rPr>
+        <w:t xml:space="preserve">`DIRECT_URL`</w:t>
+      </w:r>
+      <w:r>
+        <w:rPr>
+          <w:i/>
+          <w:iCs/>
+          <w:color w:val="6B7280"/>
+          <w:sz w:val="21"/>
+          <w:szCs w:val="21"/>
+        </w:rPr>
+        <w:t xml:space="preserve">. Same value, different variable name — use ours when</w:t>
       </w:r>
     </w:p>
     <w:p>
@@ -619,7 +649,7 @@
           <w:sz w:val="21"/>
           <w:szCs w:val="21"/>
         </w:rPr>
-        <w:t xml:space="preserve">pooling. Give it the pooled URL and migrations fail at boot with a lock error</w:t>
+        <w:t xml:space="preserve">you paste into Render.</w:t>
       </w:r>
     </w:p>
     <w:p>
@@ -632,13 +662,25 @@
       </w:pPr>
       <w:r>
         <w:rPr>
+          <w:b/>
+          <w:bCs/>
           <w:i/>
           <w:iCs/>
           <w:color w:val="6B7280"/>
           <w:sz w:val="21"/>
           <w:szCs w:val="21"/>
         </w:rPr>
-        <w:t xml:space="preserve">that reads like a network fault. This is the single most common way to get</w:t>
+        <w:t xml:space="preserve">Why two?</w:t>
+      </w:r>
+      <w:r>
+        <w:rPr>
+          <w:i/>
+          <w:iCs/>
+          <w:color w:val="6B7280"/>
+          <w:sz w:val="21"/>
+          <w:szCs w:val="21"/>
+        </w:rPr>
+        <w:t xml:space="preserve"> The pooled endpoint is for the running app: Neon's compute scales</w:t>
       </w:r>
     </w:p>
     <w:p>
@@ -657,7 +699,195 @@
           <w:sz w:val="21"/>
           <w:szCs w:val="21"/>
         </w:rPr>
-        <w:t xml:space="preserve">this setup wrong.</w:t>
+        <w:t xml:space="preserve">to zero when idle and the pooler handles waking it and reconnecting. The direct</w:t>
+      </w:r>
+    </w:p>
+    <w:p>
+      <w:pPr>
+        <w:pBdr>
+          <w:left w:val="single" w:color="0F766E" w:sz="12" w:space="12"/>
+        </w:pBdr>
+        <w:spacing w:after="140" w:line="276"/>
+        <w:ind w:left="360"/>
+      </w:pPr>
+      <w:r>
+        <w:rPr>
+          <w:i/>
+          <w:iCs/>
+          <w:color w:val="6B7280"/>
+          <w:sz w:val="21"/>
+          <w:szCs w:val="21"/>
+        </w:rPr>
+        <w:t xml:space="preserve">one is for </w:t>
+      </w:r>
+      <w:r>
+        <w:rPr>
+          <w:rFonts w:ascii="Consolas" w:cs="Consolas" w:eastAsia="Consolas" w:hAnsi="Consolas"/>
+          <w:i/>
+          <w:iCs/>
+          <w:color w:val="6B7280"/>
+          <w:sz w:val="19"/>
+          <w:szCs w:val="19"/>
+        </w:rPr>
+        <w:t xml:space="preserve">prisma migrate</w:t>
+      </w:r>
+      <w:r>
+        <w:rPr>
+          <w:i/>
+          <w:iCs/>
+          <w:color w:val="6B7280"/>
+          <w:sz w:val="21"/>
+          <w:szCs w:val="21"/>
+        </w:rPr>
+        <w:t xml:space="preserve">, which issues DDL and takes advisory locks.</w:t>
+      </w:r>
+    </w:p>
+    <w:p>
+      <w:pPr>
+        <w:spacing w:after="140" w:line="276"/>
+      </w:pPr>
+      <w:r>
+        <w:rPr>
+          <w:color w:val="111827"/>
+          <w:sz w:val="21"/>
+          <w:szCs w:val="21"/>
+        </w:rPr>
+        <w:t xml:space="preserve">&gt;</w:t>
+      </w:r>
+    </w:p>
+    <w:p>
+      <w:pPr>
+        <w:pBdr>
+          <w:left w:val="single" w:color="0F766E" w:sz="12" w:space="12"/>
+        </w:pBdr>
+        <w:spacing w:after="140" w:line="276"/>
+        <w:ind w:left="360"/>
+      </w:pPr>
+      <w:r>
+        <w:rPr>
+          <w:i/>
+          <w:iCs/>
+          <w:color w:val="6B7280"/>
+          <w:sz w:val="21"/>
+          <w:szCs w:val="21"/>
+        </w:rPr>
+        <w:t xml:space="preserve">Neon's snippet says the direct URL is only needed on Prisma &lt; 5.10, and this</w:t>
+      </w:r>
+    </w:p>
+    <w:p>
+      <w:pPr>
+        <w:pBdr>
+          <w:left w:val="single" w:color="0F766E" w:sz="12" w:space="12"/>
+        </w:pBdr>
+        <w:spacing w:after="140" w:line="276"/>
+        <w:ind w:left="360"/>
+      </w:pPr>
+      <w:r>
+        <w:rPr>
+          <w:i/>
+          <w:iCs/>
+          <w:color w:val="6B7280"/>
+          <w:sz w:val="21"/>
+          <w:szCs w:val="21"/>
+        </w:rPr>
+        <w:t xml:space="preserve">project is on 5.22 — so strictly it would work without. Set it anyway. It is</w:t>
+      </w:r>
+    </w:p>
+    <w:p>
+      <w:pPr>
+        <w:pBdr>
+          <w:left w:val="single" w:color="0F766E" w:sz="12" w:space="12"/>
+        </w:pBdr>
+        <w:spacing w:after="140" w:line="276"/>
+        <w:ind w:left="360"/>
+      </w:pPr>
+      <w:r>
+        <w:rPr>
+          <w:i/>
+          <w:iCs/>
+          <w:color w:val="6B7280"/>
+          <w:sz w:val="21"/>
+          <w:szCs w:val="21"/>
+        </w:rPr>
+        <w:t xml:space="preserve">the configuration Prisma documents for a pooled database, it costs nothing, and</w:t>
+      </w:r>
+    </w:p>
+    <w:p>
+      <w:pPr>
+        <w:pBdr>
+          <w:left w:val="single" w:color="0F766E" w:sz="12" w:space="12"/>
+        </w:pBdr>
+        <w:spacing w:after="140" w:line="276"/>
+        <w:ind w:left="360"/>
+      </w:pPr>
+      <w:r>
+        <w:rPr>
+          <w:i/>
+          <w:iCs/>
+          <w:color w:val="6B7280"/>
+          <w:sz w:val="21"/>
+          <w:szCs w:val="21"/>
+        </w:rPr>
+        <w:t xml:space="preserve">it removes a class of migration failure rather than trusting the pooler to</w:t>
+      </w:r>
+    </w:p>
+    <w:p>
+      <w:pPr>
+        <w:pBdr>
+          <w:left w:val="single" w:color="0F766E" w:sz="12" w:space="12"/>
+        </w:pBdr>
+        <w:spacing w:after="140" w:line="276"/>
+        <w:ind w:left="360"/>
+      </w:pPr>
+      <w:r>
+        <w:rPr>
+          <w:i/>
+          <w:iCs/>
+          <w:color w:val="6B7280"/>
+          <w:sz w:val="21"/>
+          <w:szCs w:val="21"/>
+        </w:rPr>
+        <w:t xml:space="preserve">handle DDL correctly. </w:t>
+      </w:r>
+      <w:r>
+        <w:rPr>
+          <w:rFonts w:ascii="Consolas" w:cs="Consolas" w:eastAsia="Consolas" w:hAnsi="Consolas"/>
+          <w:i/>
+          <w:iCs/>
+          <w:color w:val="6B7280"/>
+          <w:sz w:val="19"/>
+          <w:szCs w:val="19"/>
+        </w:rPr>
+        <w:t xml:space="preserve">schema.prisma</w:t>
+      </w:r>
+      <w:r>
+        <w:rPr>
+          <w:i/>
+          <w:iCs/>
+          <w:color w:val="6B7280"/>
+          <w:sz w:val="21"/>
+          <w:szCs w:val="21"/>
+        </w:rPr>
+        <w:t xml:space="preserve"> declares it and the env check requires</w:t>
+      </w:r>
+    </w:p>
+    <w:p>
+      <w:pPr>
+        <w:pBdr>
+          <w:left w:val="single" w:color="0F766E" w:sz="12" w:space="12"/>
+        </w:pBdr>
+        <w:spacing w:after="140" w:line="276"/>
+        <w:ind w:left="360"/>
+      </w:pPr>
+      <w:r>
+        <w:rPr>
+          <w:i/>
+          <w:iCs/>
+          <w:color w:val="6B7280"/>
+          <w:sz w:val="21"/>
+          <w:szCs w:val="21"/>
+        </w:rPr>
+        <w:t xml:space="preserve">it.</w:t>
       </w:r>
     </w:p>
     <w:p>
@@ -732,7 +962,7 @@
         </w:rPr>
         <w:t xml:space="preserve">Sign up at </w:t>
       </w:r>
-      <w:hyperlink w:history="1" r:id="rIdlll48qjwdf-ojsg2ybitl">
+      <w:hyperlink w:history="1" r:id="rIdei9eo9qok90gtukqowa35">
         <w:r>
           <w:rPr>
             <w:rStyle w:val="Hyperlink"/>
@@ -2929,7 +3159,7 @@
         </w:rPr>
         <w:t xml:space="preserve"> Create a key at </w:t>
       </w:r>
-      <w:hyperlink w:history="1" r:id="rId-memu3bjmkotsft0xu2ij">
+      <w:hyperlink w:history="1" r:id="rId7ah9dj164vqgccap_vw7z">
         <w:r>
           <w:rPr>
             <w:rStyle w:val="Hyperlink"/>
@@ -3867,7 +4097,132 @@
                 <w:sz w:val="20"/>
                 <w:szCs w:val="20"/>
               </w:rPr>
-              <w:t xml:space="preserve"> was pasted whole — Neon's strings are long and easy to truncate — and that the Neon project is not suspended.</w:t>
+              <w:t xml:space="preserve"> was pasted whole — Neon's strings are long and easy to truncate — and that you clicked </w:t>
+            </w:r>
+            <w:r>
+              <w:rPr>
+                <w:b w:val="false"/>
+                <w:bCs w:val="false"/>
+                <w:color w:val="111827"/>
+                <w:sz w:val="20"/>
+                <w:szCs w:val="20"/>
+              </w:rPr>
+              <w:t xml:space="preserve">Show password</w:t>
+            </w:r>
+            <w:r>
+              <w:rPr>
+                <w:b w:val="false"/>
+                <w:bCs w:val="false"/>
+                <w:color w:val="111827"/>
+                <w:sz w:val="20"/>
+                <w:szCs w:val="20"/>
+              </w:rPr>
+              <w:t xml:space="preserve"> first, so it is the real password and not a row of asterisks.</w:t>
+            </w:r>
+          </w:p>
+        </w:tc>
+      </w:tr>
+      <w:tr>
+        <w:tc>
+          <w:tcPr>
+            <w:tcMar>
+              <w:top w:type="dxa" w:w="80"/>
+              <w:left w:type="dxa" w:w="120"/>
+              <w:bottom w:type="dxa" w:w="80"/>
+              <w:right w:type="dxa" w:w="120"/>
+            </w:tcMar>
+          </w:tcPr>
+          <w:p>
+            <w:pPr>
+              <w:spacing w:after="0" w:line="252"/>
+            </w:pPr>
+            <w:r>
+              <w:rPr>
+                <w:b w:val="false"/>
+                <w:bCs w:val="false"/>
+                <w:color w:val="111827"/>
+                <w:sz w:val="20"/>
+                <w:szCs w:val="20"/>
+              </w:rPr>
+              <w:t xml:space="preserve">Deploy log complains about an unrecognised parameter, mentioning </w:t>
+            </w:r>
+            <w:r>
+              <w:rPr>
+                <w:rFonts w:ascii="Consolas" w:cs="Consolas" w:eastAsia="Consolas" w:hAnsi="Consolas"/>
+                <w:b w:val="false"/>
+                <w:bCs w:val="false"/>
+                <w:color w:val="111827"/>
+                <w:sz w:val="19"/>
+                <w:szCs w:val="19"/>
+              </w:rPr>
+              <w:t xml:space="preserve">channel_binding</w:t>
+            </w:r>
+          </w:p>
+        </w:tc>
+        <w:tc>
+          <w:tcPr>
+            <w:tcMar>
+              <w:top w:type="dxa" w:w="80"/>
+              <w:left w:type="dxa" w:w="120"/>
+              <w:bottom w:type="dxa" w:w="80"/>
+              <w:right w:type="dxa" w:w="120"/>
+            </w:tcMar>
+          </w:tcPr>
+          <w:p>
+            <w:pPr>
+              <w:spacing w:after="0" w:line="252"/>
+            </w:pPr>
+            <w:r>
+              <w:rPr>
+                <w:b w:val="false"/>
+                <w:bCs w:val="false"/>
+                <w:color w:val="111827"/>
+                <w:sz w:val="20"/>
+                <w:szCs w:val="20"/>
+              </w:rPr>
+              <w:t xml:space="preserve">Neon appends </w:t>
+            </w:r>
+            <w:r>
+              <w:rPr>
+                <w:rFonts w:ascii="Consolas" w:cs="Consolas" w:eastAsia="Consolas" w:hAnsi="Consolas"/>
+                <w:b w:val="false"/>
+                <w:bCs w:val="false"/>
+                <w:color w:val="111827"/>
+                <w:sz w:val="19"/>
+                <w:szCs w:val="19"/>
+              </w:rPr>
+              <w:t xml:space="preserve">&amp;channel_binding=require</w:t>
+            </w:r>
+            <w:r>
+              <w:rPr>
+                <w:b w:val="false"/>
+                <w:bCs w:val="false"/>
+                <w:color w:val="111827"/>
+                <w:sz w:val="20"/>
+                <w:szCs w:val="20"/>
+              </w:rPr>
+              <w:t xml:space="preserve"> to its strings. If Prisma objects, delete that parameter from both URLs. </w:t>
+            </w:r>
+            <w:r>
+              <w:rPr>
+                <w:rFonts w:ascii="Consolas" w:cs="Consolas" w:eastAsia="Consolas" w:hAnsi="Consolas"/>
+                <w:b w:val="false"/>
+                <w:bCs w:val="false"/>
+                <w:color w:val="111827"/>
+                <w:sz w:val="19"/>
+                <w:szCs w:val="19"/>
+              </w:rPr>
+              <w:t xml:space="preserve">sslmode=require</w:t>
+            </w:r>
+            <w:r>
+              <w:rPr>
+                <w:b w:val="false"/>
+                <w:bCs w:val="false"/>
+                <w:color w:val="111827"/>
+                <w:sz w:val="20"/>
+                <w:szCs w:val="20"/>
+              </w:rPr>
+              <w:t xml:space="preserve"> is the one that matters.</w:t>
             </w:r>
           </w:p>
         </w:tc>

</xml_diff>

<commit_message>
Record what the first real deploy taught us
Four things cost time on the way to a live URL, and all four are now in the
troubleshooting table rather than in my head:

- NODE_ENV=production makes npm skip devDependencies at install time, so the
  build compiles with whatever tsc is on the image instead of the pinned one
- fromService: property: host gives a hostname, not a URL
- engines is a floor, not a pin: the host ran Node 26 against a repo developed
  on 22
- service names are global, so both services got random suffixes, with
  different suffixes for each

The guide previously said a suffix was possible. It is not possible, it is what
happens — both names were taken. Reworded so nobody predicts their URLs again.
</commit_message>
<xml_diff>
--- a/docs/word/DEPLOY.docx
+++ b/docs/word/DEPLOY.docx
@@ -228,7 +228,7 @@
         </w:rPr>
         <w:t xml:space="preserve">Sign up at </w:t>
       </w:r>
-      <w:hyperlink w:history="1" r:id="rIdsvoj5baf0oke3jj2iadaf">
+      <w:hyperlink w:history="1" r:id="rIdyskwb_burmlez-iuhotfn">
         <w:r>
           <w:rPr>
             <w:rStyle w:val="Hyperlink"/>
@@ -962,7 +962,7 @@
         </w:rPr>
         <w:t xml:space="preserve">Sign up at </w:t>
       </w:r>
-      <w:hyperlink w:history="1" r:id="rIdvlu4iqag5ohltlinasqe8">
+      <w:hyperlink w:history="1" r:id="rIdk0fjxzat_-fvomniq_d6p">
         <w:r>
           <w:rPr>
             <w:rStyle w:val="Hyperlink"/>
@@ -1799,7 +1799,7 @@
           <w:sz w:val="21"/>
           <w:szCs w:val="21"/>
         </w:rPr>
-        <w:t xml:space="preserve">If Render says a name is taken</w:t>
+        <w:t xml:space="preserve">Expect a suffix.</w:t>
       </w:r>
       <w:r>
         <w:rPr>
@@ -1809,7 +1809,7 @@
           <w:sz w:val="21"/>
           <w:szCs w:val="21"/>
         </w:rPr>
-        <w:t xml:space="preserve">, it appends a suffix — you might get</w:t>
+        <w:t xml:space="preserve"> Service names are global across all of Render, and both</w:t>
       </w:r>
     </w:p>
     <w:p>
@@ -1829,7 +1829,7 @@
           <w:sz w:val="19"/>
           <w:szCs w:val="19"/>
         </w:rPr>
-        <w:t xml:space="preserve">bizpilot-api-a4f2</w:t>
+        <w:t xml:space="preserve">bizpilot-api</w:t>
       </w:r>
       <w:r>
         <w:rPr>
@@ -1839,17 +1839,18 @@
           <w:sz w:val="21"/>
           <w:szCs w:val="21"/>
         </w:rPr>
-        <w:t xml:space="preserve">. Fine, just use </w:t>
-      </w:r>
-      <w:r>
-        <w:rPr>
+        <w:t xml:space="preserve"> and </w:t>
+      </w:r>
+      <w:r>
+        <w:rPr>
+          <w:rFonts w:ascii="Consolas" w:cs="Consolas" w:eastAsia="Consolas" w:hAnsi="Consolas"/>
           <w:i/>
           <w:iCs/>
           <w:color w:val="6B7280"/>
-          <w:sz w:val="21"/>
-          <w:szCs w:val="21"/>
-        </w:rPr>
-        <w:t xml:space="preserve">your</w:t>
+          <w:sz w:val="19"/>
+          <w:szCs w:val="19"/>
+        </w:rPr>
+        <w:t xml:space="preserve">bizpilot-web</w:t>
       </w:r>
       <w:r>
         <w:rPr>
@@ -1859,7 +1860,7 @@
           <w:sz w:val="21"/>
           <w:szCs w:val="21"/>
         </w:rPr>
-        <w:t xml:space="preserve"> actual URLs everywhere below</w:t>
+        <w:t xml:space="preserve"> are already taken — so you will get</w:t>
       </w:r>
     </w:p>
     <w:p>
@@ -1878,7 +1879,97 @@
           <w:sz w:val="21"/>
           <w:szCs w:val="21"/>
         </w:rPr>
-        <w:t xml:space="preserve">instead of the example ones.</w:t>
+        <w:t xml:space="preserve">something like </w:t>
+      </w:r>
+      <w:r>
+        <w:rPr>
+          <w:rFonts w:ascii="Consolas" w:cs="Consolas" w:eastAsia="Consolas" w:hAnsi="Consolas"/>
+          <w:i/>
+          <w:iCs/>
+          <w:color w:val="6B7280"/>
+          <w:sz w:val="19"/>
+          <w:szCs w:val="19"/>
+        </w:rPr>
+        <w:t xml:space="preserve">bizpilot-api-si8e</w:t>
+      </w:r>
+      <w:r>
+        <w:rPr>
+          <w:i/>
+          <w:iCs/>
+          <w:color w:val="6B7280"/>
+          <w:sz w:val="21"/>
+          <w:szCs w:val="21"/>
+        </w:rPr>
+        <w:t xml:space="preserve"> and </w:t>
+      </w:r>
+      <w:r>
+        <w:rPr>
+          <w:rFonts w:ascii="Consolas" w:cs="Consolas" w:eastAsia="Consolas" w:hAnsi="Consolas"/>
+          <w:i/>
+          <w:iCs/>
+          <w:color w:val="6B7280"/>
+          <w:sz w:val="19"/>
+          <w:szCs w:val="19"/>
+        </w:rPr>
+        <w:t xml:space="preserve">bizpilot-web-mr4y</w:t>
+      </w:r>
+      <w:r>
+        <w:rPr>
+          <w:i/>
+          <w:iCs/>
+          <w:color w:val="6B7280"/>
+          <w:sz w:val="21"/>
+          <w:szCs w:val="21"/>
+        </w:rPr>
+        <w:t xml:space="preserve">, with </w:t>
+      </w:r>
+      <w:r>
+        <w:rPr>
+          <w:i/>
+          <w:iCs/>
+          <w:color w:val="6B7280"/>
+          <w:sz w:val="21"/>
+          <w:szCs w:val="21"/>
+        </w:rPr>
+        <w:t xml:space="preserve">different</w:t>
+      </w:r>
+    </w:p>
+    <w:p>
+      <w:pPr>
+        <w:pBdr>
+          <w:left w:val="single" w:color="0F766E" w:sz="12" w:space="12"/>
+        </w:pBdr>
+        <w:spacing w:after="140" w:line="276"/>
+        <w:ind w:left="360"/>
+      </w:pPr>
+      <w:r>
+        <w:rPr>
+          <w:i/>
+          <w:iCs/>
+          <w:color w:val="6B7280"/>
+          <w:sz w:val="21"/>
+          <w:szCs w:val="21"/>
+        </w:rPr>
+        <w:t xml:space="preserve">suffixes for each. Do not guess them and do not assume they match. Step 3</w:t>
+      </w:r>
+    </w:p>
+    <w:p>
+      <w:pPr>
+        <w:pBdr>
+          <w:left w:val="single" w:color="0F766E" w:sz="12" w:space="12"/>
+        </w:pBdr>
+        <w:spacing w:after="140" w:line="276"/>
+        <w:ind w:left="360"/>
+      </w:pPr>
+      <w:r>
+        <w:rPr>
+          <w:i/>
+          <w:iCs/>
+          <w:color w:val="6B7280"/>
+          <w:sz w:val="21"/>
+          <w:szCs w:val="21"/>
+        </w:rPr>
+        <w:t xml:space="preserve">exists to make you read the real ones off the dashboard.</w:t>
       </w:r>
     </w:p>
     <w:p>
@@ -2009,6 +2100,133 @@
           <w:color w:val="0F766E"/>
         </w:rPr>
         <w:t xml:space="preserve">4. Wire the two services to each other</w:t>
+      </w:r>
+    </w:p>
+    <w:p>
+      <w:pPr>
+        <w:pBdr>
+          <w:left w:val="single" w:color="0F766E" w:sz="12" w:space="12"/>
+        </w:pBdr>
+        <w:spacing w:after="140" w:line="276"/>
+        <w:ind w:left="360"/>
+      </w:pPr>
+      <w:r>
+        <w:rPr>
+          <w:i/>
+          <w:iCs/>
+          <w:color w:val="6B7280"/>
+          <w:sz w:val="21"/>
+          <w:szCs w:val="21"/>
+        </w:rPr>
+        <w:t xml:space="preserve">Once you know the real URLs, the tidier place for them is </w:t>
+      </w:r>
+      <w:r>
+        <w:rPr>
+          <w:rFonts w:ascii="Consolas" w:cs="Consolas" w:eastAsia="Consolas" w:hAnsi="Consolas"/>
+          <w:i/>
+          <w:iCs/>
+          <w:color w:val="6B7280"/>
+          <w:sz w:val="19"/>
+          <w:szCs w:val="19"/>
+        </w:rPr>
+        <w:t xml:space="preserve">render.yaml</w:t>
+      </w:r>
+    </w:p>
+    <w:p>
+      <w:pPr>
+        <w:pBdr>
+          <w:left w:val="single" w:color="0F766E" w:sz="12" w:space="12"/>
+        </w:pBdr>
+        <w:spacing w:after="140" w:line="276"/>
+        <w:ind w:left="360"/>
+      </w:pPr>
+      <w:r>
+        <w:rPr>
+          <w:i/>
+          <w:iCs/>
+          <w:color w:val="6B7280"/>
+          <w:sz w:val="21"/>
+          <w:szCs w:val="21"/>
+        </w:rPr>
+        <w:t xml:space="preserve">itself, as plain </w:t>
+      </w:r>
+      <w:r>
+        <w:rPr>
+          <w:rFonts w:ascii="Consolas" w:cs="Consolas" w:eastAsia="Consolas" w:hAnsi="Consolas"/>
+          <w:i/>
+          <w:iCs/>
+          <w:color w:val="6B7280"/>
+          <w:sz w:val="19"/>
+          <w:szCs w:val="19"/>
+        </w:rPr>
+        <w:t xml:space="preserve">value:</w:t>
+      </w:r>
+      <w:r>
+        <w:rPr>
+          <w:i/>
+          <w:iCs/>
+          <w:color w:val="6B7280"/>
+          <w:sz w:val="21"/>
+          <w:szCs w:val="21"/>
+        </w:rPr>
+        <w:t xml:space="preserve"> entries — that is what this repo now does. They are</w:t>
+      </w:r>
+    </w:p>
+    <w:p>
+      <w:pPr>
+        <w:pBdr>
+          <w:left w:val="single" w:color="0F766E" w:sz="12" w:space="12"/>
+        </w:pBdr>
+        <w:spacing w:after="140" w:line="276"/>
+        <w:ind w:left="360"/>
+      </w:pPr>
+      <w:r>
+        <w:rPr>
+          <w:i/>
+          <w:iCs/>
+          <w:color w:val="6B7280"/>
+          <w:sz w:val="21"/>
+          <w:szCs w:val="21"/>
+        </w:rPr>
+        <w:t xml:space="preserve">not secrets, they are facts about the deployment, and keeping them in the</w:t>
+      </w:r>
+    </w:p>
+    <w:p>
+      <w:pPr>
+        <w:pBdr>
+          <w:left w:val="single" w:color="0F766E" w:sz="12" w:space="12"/>
+        </w:pBdr>
+        <w:spacing w:after="140" w:line="276"/>
+        <w:ind w:left="360"/>
+      </w:pPr>
+      <w:r>
+        <w:rPr>
+          <w:i/>
+          <w:iCs/>
+          <w:color w:val="6B7280"/>
+          <w:sz w:val="21"/>
+          <w:szCs w:val="21"/>
+        </w:rPr>
+        <w:t xml:space="preserve">blueprint means a re-sync restores them instead of quietly reverting to blank.</w:t>
+      </w:r>
+    </w:p>
+    <w:p>
+      <w:pPr>
+        <w:pBdr>
+          <w:left w:val="single" w:color="0F766E" w:sz="12" w:space="12"/>
+        </w:pBdr>
+        <w:spacing w:after="140" w:line="276"/>
+        <w:ind w:left="360"/>
+      </w:pPr>
+      <w:r>
+        <w:rPr>
+          <w:i/>
+          <w:iCs/>
+          <w:color w:val="6B7280"/>
+          <w:sz w:val="21"/>
+          <w:szCs w:val="21"/>
+        </w:rPr>
+        <w:t xml:space="preserve">Change them there and push; the steps below are for setting them by hand.</w:t>
       </w:r>
     </w:p>
     <w:p>
@@ -3159,7 +3377,7 @@
         </w:rPr>
         <w:t xml:space="preserve"> Create a key at </w:t>
       </w:r>
-      <w:hyperlink w:history="1" r:id="rIdpugd4abpnhgbazwf-t_tn">
+      <w:hyperlink w:history="1" r:id="rIdoqtglkhx4sqkdxu7udknn">
         <w:r>
           <w:rPr>
             <w:rStyle w:val="Hyperlink"/>
@@ -4924,6 +5142,331 @@
                 <w:szCs w:val="20"/>
               </w:rPr>
               <w:t xml:space="preserve"> locally, commit the lock file, push.</w:t>
+            </w:r>
+          </w:p>
+        </w:tc>
+      </w:tr>
+      <w:tr>
+        <w:tc>
+          <w:tcPr>
+            <w:tcMar>
+              <w:top w:type="dxa" w:w="80"/>
+              <w:left w:type="dxa" w:w="120"/>
+              <w:bottom w:type="dxa" w:w="80"/>
+              <w:right w:type="dxa" w:w="120"/>
+            </w:tcMar>
+          </w:tcPr>
+          <w:p>
+            <w:pPr>
+              <w:spacing w:after="0" w:line="252"/>
+            </w:pPr>
+            <w:r>
+              <w:rPr>
+                <w:b w:val="false"/>
+                <w:bCs w:val="false"/>
+                <w:color w:val="111827"/>
+                <w:sz w:val="20"/>
+                <w:szCs w:val="20"/>
+              </w:rPr>
+              <w:t xml:space="preserve">Build fails compiling TypeScript with an error about a setting that works locally</w:t>
+            </w:r>
+          </w:p>
+        </w:tc>
+        <w:tc>
+          <w:tcPr>
+            <w:tcMar>
+              <w:top w:type="dxa" w:w="80"/>
+              <w:left w:type="dxa" w:w="120"/>
+              <w:bottom w:type="dxa" w:w="80"/>
+              <w:right w:type="dxa" w:w="120"/>
+            </w:tcMar>
+          </w:tcPr>
+          <w:p>
+            <w:pPr>
+              <w:spacing w:after="0" w:line="252"/>
+            </w:pPr>
+            <w:r>
+              <w:rPr>
+                <w:rFonts w:ascii="Consolas" w:cs="Consolas" w:eastAsia="Consolas" w:hAnsi="Consolas"/>
+                <w:b w:val="false"/>
+                <w:bCs w:val="false"/>
+                <w:color w:val="111827"/>
+                <w:sz w:val="19"/>
+                <w:szCs w:val="19"/>
+              </w:rPr>
+              <w:t xml:space="preserve">NODE_ENV=production</w:t>
+            </w:r>
+            <w:r>
+              <w:rPr>
+                <w:b w:val="false"/>
+                <w:bCs w:val="false"/>
+                <w:color w:val="111827"/>
+                <w:sz w:val="20"/>
+                <w:szCs w:val="20"/>
+              </w:rPr>
+              <w:t xml:space="preserve"> makes npm skip devDependencies at install time, so the project's own TypeScript is missing and </w:t>
+            </w:r>
+            <w:r>
+              <w:rPr>
+                <w:rFonts w:ascii="Consolas" w:cs="Consolas" w:eastAsia="Consolas" w:hAnsi="Consolas"/>
+                <w:b w:val="false"/>
+                <w:bCs w:val="false"/>
+                <w:color w:val="111827"/>
+                <w:sz w:val="19"/>
+                <w:szCs w:val="19"/>
+              </w:rPr>
+              <w:t xml:space="preserve">tsc</w:t>
+            </w:r>
+            <w:r>
+              <w:rPr>
+                <w:b w:val="false"/>
+                <w:bCs w:val="false"/>
+                <w:color w:val="111827"/>
+                <w:sz w:val="20"/>
+                <w:szCs w:val="20"/>
+              </w:rPr>
+              <w:t xml:space="preserve"> resolves to whatever is on the image's PATH. Both build commands pass </w:t>
+            </w:r>
+            <w:r>
+              <w:rPr>
+                <w:rFonts w:ascii="Consolas" w:cs="Consolas" w:eastAsia="Consolas" w:hAnsi="Consolas"/>
+                <w:b w:val="false"/>
+                <w:bCs w:val="false"/>
+                <w:color w:val="111827"/>
+                <w:sz w:val="19"/>
+                <w:szCs w:val="19"/>
+              </w:rPr>
+              <w:t xml:space="preserve">--include=dev</w:t>
+            </w:r>
+            <w:r>
+              <w:rPr>
+                <w:b w:val="false"/>
+                <w:bCs w:val="false"/>
+                <w:color w:val="111827"/>
+                <w:sz w:val="20"/>
+                <w:szCs w:val="20"/>
+              </w:rPr>
+              <w:t xml:space="preserve"> for this reason — do not remove it.</w:t>
+            </w:r>
+          </w:p>
+        </w:tc>
+      </w:tr>
+      <w:tr>
+        <w:tc>
+          <w:tcPr>
+            <w:tcMar>
+              <w:top w:type="dxa" w:w="80"/>
+              <w:left w:type="dxa" w:w="120"/>
+              <w:bottom w:type="dxa" w:w="80"/>
+              <w:right w:type="dxa" w:w="120"/>
+            </w:tcMar>
+          </w:tcPr>
+          <w:p>
+            <w:pPr>
+              <w:spacing w:after="0" w:line="252"/>
+            </w:pPr>
+            <w:r>
+              <w:rPr>
+                <w:b w:val="false"/>
+                <w:bCs w:val="false"/>
+                <w:color w:val="111827"/>
+                <w:sz w:val="20"/>
+                <w:szCs w:val="20"/>
+              </w:rPr>
+              <w:t xml:space="preserve">The app boots locally but not on Render, on a value Render generated</w:t>
+            </w:r>
+          </w:p>
+        </w:tc>
+        <w:tc>
+          <w:tcPr>
+            <w:tcMar>
+              <w:top w:type="dxa" w:w="80"/>
+              <w:left w:type="dxa" w:w="120"/>
+              <w:bottom w:type="dxa" w:w="80"/>
+              <w:right w:type="dxa" w:w="120"/>
+            </w:tcMar>
+          </w:tcPr>
+          <w:p>
+            <w:pPr>
+              <w:spacing w:after="0" w:line="252"/>
+            </w:pPr>
+            <w:r>
+              <w:rPr>
+                <w:rFonts w:ascii="Consolas" w:cs="Consolas" w:eastAsia="Consolas" w:hAnsi="Consolas"/>
+                <w:b w:val="false"/>
+                <w:bCs w:val="false"/>
+                <w:color w:val="111827"/>
+                <w:sz w:val="19"/>
+                <w:szCs w:val="19"/>
+              </w:rPr>
+              <w:t xml:space="preserve">fromService: { property: host }</w:t>
+            </w:r>
+            <w:r>
+              <w:rPr>
+                <w:b w:val="false"/>
+                <w:bCs w:val="false"/>
+                <w:color w:val="111827"/>
+                <w:sz w:val="20"/>
+                <w:szCs w:val="20"/>
+              </w:rPr>
+              <w:t xml:space="preserve"> yields a bare hostname, not a URL. </w:t>
+            </w:r>
+            <w:r>
+              <w:rPr>
+                <w:rFonts w:ascii="Consolas" w:cs="Consolas" w:eastAsia="Consolas" w:hAnsi="Consolas"/>
+                <w:b w:val="false"/>
+                <w:bCs w:val="false"/>
+                <w:color w:val="111827"/>
+                <w:sz w:val="19"/>
+                <w:szCs w:val="19"/>
+              </w:rPr>
+              <w:t xml:space="preserve">WEB_URL</w:t>
+            </w:r>
+            <w:r>
+              <w:rPr>
+                <w:b w:val="false"/>
+                <w:bCs w:val="false"/>
+                <w:color w:val="111827"/>
+                <w:sz w:val="20"/>
+                <w:szCs w:val="20"/>
+              </w:rPr>
+              <w:t xml:space="preserve"> and </w:t>
+            </w:r>
+            <w:r>
+              <w:rPr>
+                <w:rFonts w:ascii="Consolas" w:cs="Consolas" w:eastAsia="Consolas" w:hAnsi="Consolas"/>
+                <w:b w:val="false"/>
+                <w:bCs w:val="false"/>
+                <w:color w:val="111827"/>
+                <w:sz w:val="19"/>
+                <w:szCs w:val="19"/>
+              </w:rPr>
+              <w:t xml:space="preserve">API_URL</w:t>
+            </w:r>
+            <w:r>
+              <w:rPr>
+                <w:b w:val="false"/>
+                <w:bCs w:val="false"/>
+                <w:color w:val="111827"/>
+                <w:sz w:val="20"/>
+                <w:szCs w:val="20"/>
+              </w:rPr>
+              <w:t xml:space="preserve"> prefix </w:t>
+            </w:r>
+            <w:r>
+              <w:rPr>
+                <w:rFonts w:ascii="Consolas" w:cs="Consolas" w:eastAsia="Consolas" w:hAnsi="Consolas"/>
+                <w:b w:val="false"/>
+                <w:bCs w:val="false"/>
+                <w:color w:val="111827"/>
+                <w:sz w:val="19"/>
+                <w:szCs w:val="19"/>
+              </w:rPr>
+              <w:t xml:space="preserve">https://</w:t>
+            </w:r>
+            <w:r>
+              <w:rPr>
+                <w:b w:val="false"/>
+                <w:bCs w:val="false"/>
+                <w:color w:val="111827"/>
+                <w:sz w:val="20"/>
+                <w:szCs w:val="20"/>
+              </w:rPr>
+              <w:t xml:space="preserve"> themselves; anything new that needs a URL should too.</w:t>
+            </w:r>
+          </w:p>
+        </w:tc>
+      </w:tr>
+      <w:tr>
+        <w:tc>
+          <w:tcPr>
+            <w:tcMar>
+              <w:top w:type="dxa" w:w="80"/>
+              <w:left w:type="dxa" w:w="120"/>
+              <w:bottom w:type="dxa" w:w="80"/>
+              <w:right w:type="dxa" w:w="120"/>
+            </w:tcMar>
+          </w:tcPr>
+          <w:p>
+            <w:pPr>
+              <w:spacing w:after="0" w:line="252"/>
+            </w:pPr>
+            <w:r>
+              <w:rPr>
+                <w:b w:val="false"/>
+                <w:bCs w:val="false"/>
+                <w:color w:val="111827"/>
+                <w:sz w:val="20"/>
+                <w:szCs w:val="20"/>
+              </w:rPr>
+              <w:t xml:space="preserve">A deploy behaves differently from your machine for no clear reason</w:t>
+            </w:r>
+          </w:p>
+        </w:tc>
+        <w:tc>
+          <w:tcPr>
+            <w:tcMar>
+              <w:top w:type="dxa" w:w="80"/>
+              <w:left w:type="dxa" w:w="120"/>
+              <w:bottom w:type="dxa" w:w="80"/>
+              <w:right w:type="dxa" w:w="120"/>
+            </w:tcMar>
+          </w:tcPr>
+          <w:p>
+            <w:pPr>
+              <w:spacing w:after="0" w:line="252"/>
+            </w:pPr>
+            <w:r>
+              <w:rPr>
+                <w:b w:val="false"/>
+                <w:bCs w:val="false"/>
+                <w:color w:val="111827"/>
+                <w:sz w:val="20"/>
+                <w:szCs w:val="20"/>
+              </w:rPr>
+              <w:t xml:space="preserve">Check the Node version in the build log. </w:t>
+            </w:r>
+            <w:r>
+              <w:rPr>
+                <w:rFonts w:ascii="Consolas" w:cs="Consolas" w:eastAsia="Consolas" w:hAnsi="Consolas"/>
+                <w:b w:val="false"/>
+                <w:bCs w:val="false"/>
+                <w:color w:val="111827"/>
+                <w:sz w:val="19"/>
+                <w:szCs w:val="19"/>
+              </w:rPr>
+              <w:t xml:space="preserve">engines</w:t>
+            </w:r>
+            <w:r>
+              <w:rPr>
+                <w:b w:val="false"/>
+                <w:bCs w:val="false"/>
+                <w:color w:val="111827"/>
+                <w:sz w:val="20"/>
+                <w:szCs w:val="20"/>
+              </w:rPr>
+              <w:t xml:space="preserve"> is a floor, not a pin — </w:t>
+            </w:r>
+            <w:r>
+              <w:rPr>
+                <w:rFonts w:ascii="Consolas" w:cs="Consolas" w:eastAsia="Consolas" w:hAnsi="Consolas"/>
+                <w:b w:val="false"/>
+                <w:bCs w:val="false"/>
+                <w:color w:val="111827"/>
+                <w:sz w:val="19"/>
+                <w:szCs w:val="19"/>
+              </w:rPr>
+              <w:t xml:space="preserve">NODE_VERSION</w:t>
+            </w:r>
+            <w:r>
+              <w:rPr>
+                <w:b w:val="false"/>
+                <w:bCs w:val="false"/>
+                <w:color w:val="111827"/>
+                <w:sz w:val="20"/>
+                <w:szCs w:val="20"/>
+              </w:rPr>
+              <w:t xml:space="preserve"> is set to 22 on both services to stop the host picking something newer.</w:t>
             </w:r>
           </w:p>
         </w:tc>

</xml_diff>

<commit_message>
Document the free path to working MoMo and bank payments
The integration already offers card, Rwandan mobile money and bank transfer;
what was missing was a straight account of what switching it on costs and in
what order to do it.

Separates the two things that get conflated. Setup, the account and test mode
are genuinely free and unlimited — a customer paying an invoice by MoMo can be
demonstrated today for nothing. Per-transaction fees are not free and cannot be,
because that is how a processor exists; the part that matters is that they come
out of money arriving rather than out of pocket, so nothing is owed before there
is revenue.

Live keys need identity, business registration and a settlement account. Free to
submit, days to clear, and the real gate — worth starting before it is needed.
</commit_message>
<xml_diff>
--- a/docs/word/DEPLOY.docx
+++ b/docs/word/DEPLOY.docx
@@ -29,7 +29,7 @@
           <w:sz w:val="18"/>
           <w:szCs w:val="18"/>
         </w:rPr>
-        <w:t xml:space="preserve">Generated from the repository on 2026-08-10. The markdown source is authoritative.</w:t>
+        <w:t xml:space="preserve">Generated from the repository on 2026-08-11. The markdown source is authoritative.</w:t>
       </w:r>
     </w:p>
     <w:p>
@@ -228,7 +228,7 @@
         </w:rPr>
         <w:t xml:space="preserve">Sign up at </w:t>
       </w:r>
-      <w:hyperlink w:history="1" r:id="rId1qzd3mtdx-igvmokrmsbv">
+      <w:hyperlink w:history="1" r:id="rIdk2ztdf_d4ospf8qaip2hg">
         <w:r>
           <w:rPr>
             <w:rStyle w:val="Hyperlink"/>
@@ -962,7 +962,7 @@
         </w:rPr>
         <w:t xml:space="preserve">Sign up at </w:t>
       </w:r>
-      <w:hyperlink w:history="1" r:id="rIdb0rxu99kudzn8yb0bwo_j">
+      <w:hyperlink w:history="1" r:id="rIddzaay83-6s-ruohluwgyy">
         <w:r>
           <w:rPr>
             <w:rStyle w:val="Hyperlink"/>
@@ -3377,7 +3377,7 @@
         </w:rPr>
         <w:t xml:space="preserve"> Create a key at </w:t>
       </w:r>
-      <w:hyperlink w:history="1" r:id="rId-2p1svp9sibif__jeb9hh">
+      <w:hyperlink w:history="1" r:id="rIdrni8nzsn7fbp6z6aiwgsd">
         <w:r>
           <w:rPr>
             <w:rStyle w:val="Hyperlink"/>
@@ -3497,25 +3497,29 @@
     </w:p>
     <w:p>
       <w:pPr>
-        <w:spacing w:after="140" w:line="276"/>
+        <w:pStyle w:val="Heading3"/>
+        <w:spacing w:after="120" w:before="300"/>
       </w:pPr>
       <w:r>
         <w:rPr>
           <w:b/>
           <w:bCs/>
           <w:color w:val="111827"/>
-          <w:sz w:val="21"/>
-          <w:szCs w:val="21"/>
-        </w:rPr>
-        <w:t xml:space="preserve">Taking payments.</w:t>
-      </w:r>
-      <w:r>
-        <w:rPr>
-          <w:color w:val="111827"/>
-          <w:sz w:val="21"/>
-          <w:szCs w:val="21"/>
-        </w:rPr>
-        <w:t xml:space="preserve"> From the Flutterwave dashboard set </w:t>
+        </w:rPr>
+        <w:t xml:space="preserve">Taking payments — MoMo, bank transfer and card</w:t>
+      </w:r>
+    </w:p>
+    <w:p>
+      <w:pPr>
+        <w:spacing w:after="140" w:line="276"/>
+      </w:pPr>
+      <w:r>
+        <w:rPr>
+          <w:color w:val="111827"/>
+          <w:sz w:val="21"/>
+          <w:szCs w:val="21"/>
+        </w:rPr>
+        <w:t xml:space="preserve">The integration is finished and already offers all three in Rwanda (</w:t>
       </w:r>
       <w:r>
         <w:rPr>
@@ -3524,49 +3528,61 @@
           <w:sz w:val="19"/>
           <w:szCs w:val="19"/>
         </w:rPr>
-        <w:t xml:space="preserve">FLUTTERWAVE_PUBLIC_KEY</w:t>
-      </w:r>
-      <w:r>
-        <w:rPr>
-          <w:color w:val="111827"/>
-          <w:sz w:val="21"/>
-          <w:szCs w:val="21"/>
-        </w:rPr>
-        <w:t xml:space="preserve"> and </w:t>
-      </w:r>
-      <w:r>
-        <w:rPr>
-          <w:rFonts w:ascii="Consolas" w:cs="Consolas" w:eastAsia="Consolas" w:hAnsi="Consolas"/>
-          <w:color w:val="111827"/>
-          <w:sz w:val="19"/>
-          <w:szCs w:val="19"/>
-        </w:rPr>
-        <w:t xml:space="preserve">FLUTTERWAVE_SECRET_KEY</w:t>
-      </w:r>
-      <w:r>
-        <w:rPr>
-          <w:color w:val="111827"/>
-          <w:sz w:val="21"/>
-          <w:szCs w:val="21"/>
-        </w:rPr>
-        <w:t xml:space="preserve">. Then invent a long random string, set it as </w:t>
-      </w:r>
-      <w:r>
-        <w:rPr>
-          <w:rFonts w:ascii="Consolas" w:cs="Consolas" w:eastAsia="Consolas" w:hAnsi="Consolas"/>
-          <w:color w:val="111827"/>
-          <w:sz w:val="19"/>
-          <w:szCs w:val="19"/>
-        </w:rPr>
-        <w:t xml:space="preserve">FLUTTERWAVE_WEBHOOK_HASH</w:t>
-      </w:r>
-      <w:r>
-        <w:rPr>
-          <w:color w:val="111827"/>
-          <w:sz w:val="21"/>
-          <w:szCs w:val="21"/>
-        </w:rPr>
-        <w:t xml:space="preserve">, and paste the same value into Flutterwave → Settings → Webhooks → </w:t>
+        <w:t xml:space="preserve">card,mobilemoneyrwanda,banktransfer</w:t>
+      </w:r>
+      <w:r>
+        <w:rPr>
+          <w:color w:val="111827"/>
+          <w:sz w:val="21"/>
+          <w:szCs w:val="21"/>
+        </w:rPr>
+        <w:t xml:space="preserve">). What follows is switching it on.</w:t>
+      </w:r>
+    </w:p>
+    <w:p>
+      <w:pPr>
+        <w:spacing w:after="140" w:line="276"/>
+      </w:pPr>
+      <w:r>
+        <w:rPr>
+          <w:b/>
+          <w:bCs/>
+          <w:color w:val="111827"/>
+          <w:sz w:val="21"/>
+          <w:szCs w:val="21"/>
+        </w:rPr>
+        <w:t xml:space="preserve">What costs nothing:</w:t>
+      </w:r>
+      <w:r>
+        <w:rPr>
+          <w:color w:val="111827"/>
+          <w:sz w:val="21"/>
+          <w:szCs w:val="21"/>
+        </w:rPr>
+        <w:t xml:space="preserve"> the Flutterwave account, test mode, and this entire setup. There is no monthly fee and no setup fee, and test mode is unlimited — you can demonstrate a customer paying an invoice by MoMo today, for nothing.</w:t>
+      </w:r>
+    </w:p>
+    <w:p>
+      <w:pPr>
+        <w:spacing w:after="140" w:line="276"/>
+      </w:pPr>
+      <w:r>
+        <w:rPr>
+          <w:b/>
+          <w:bCs/>
+          <w:color w:val="111827"/>
+          <w:sz w:val="21"/>
+          <w:szCs w:val="21"/>
+        </w:rPr>
+        <w:t xml:space="preserve">What is not free, and cannot be:</w:t>
+      </w:r>
+      <w:r>
+        <w:rPr>
+          <w:color w:val="111827"/>
+          <w:sz w:val="21"/>
+          <w:szCs w:val="21"/>
+        </w:rPr>
+        <w:t xml:space="preserve"> every payment processor takes a percentage of each transaction. That is how they exist. The important part is </w:t>
       </w:r>
       <w:r>
         <w:rPr>
@@ -3576,15 +3592,114 @@
           <w:sz w:val="21"/>
           <w:szCs w:val="21"/>
         </w:rPr>
-        <w:t xml:space="preserve">Secret hash</w:t>
-      </w:r>
-      <w:r>
-        <w:rPr>
-          <w:color w:val="111827"/>
-          <w:sz w:val="21"/>
-          <w:szCs w:val="21"/>
-        </w:rPr>
-        <w:t xml:space="preserve">. Point their webhook URL at:</w:t>
+        <w:t xml:space="preserve">when</w:t>
+      </w:r>
+      <w:r>
+        <w:rPr>
+          <w:color w:val="111827"/>
+          <w:sz w:val="21"/>
+          <w:szCs w:val="21"/>
+        </w:rPr>
+        <w:t xml:space="preserve"> you pay it — it comes out of money arriving, never out of your pocket, so there is no cost before there is revenue. Check Flutterwave's current Rwanda rates yourself; they differ by channel, and mobile money is usually cheaper than card.</w:t>
+      </w:r>
+    </w:p>
+    <w:p>
+      <w:pPr>
+        <w:pStyle w:val="Heading4"/>
+        <w:spacing w:after="120" w:before="300"/>
+      </w:pPr>
+      <w:r>
+        <w:rPr>
+          <w:b/>
+          <w:bCs/>
+          <w:color w:val="111827"/>
+        </w:rPr>
+        <w:t xml:space="preserve">Test mode — do this now, free</w:t>
+      </w:r>
+    </w:p>
+    <w:p>
+      <w:pPr>
+        <w:pStyle w:val="ListParagraph"/>
+        <w:numPr>
+          <w:ilvl w:val="0"/>
+          <w:numId w:val="2"/>
+        </w:numPr>
+        <w:spacing w:after="60" w:line="264"/>
+      </w:pPr>
+      <w:r>
+        <w:rPr>
+          <w:color w:val="111827"/>
+          <w:sz w:val="21"/>
+          <w:szCs w:val="21"/>
+        </w:rPr>
+        <w:t xml:space="preserve">Sign up at flutterwave.com. Dashboard → </w:t>
+      </w:r>
+      <w:r>
+        <w:rPr>
+          <w:b/>
+          <w:bCs/>
+          <w:color w:val="111827"/>
+          <w:sz w:val="21"/>
+          <w:szCs w:val="21"/>
+        </w:rPr>
+        <w:t xml:space="preserve">Settings → API Keys</w:t>
+      </w:r>
+      <w:r>
+        <w:rPr>
+          <w:color w:val="111827"/>
+          <w:sz w:val="21"/>
+          <w:szCs w:val="21"/>
+        </w:rPr>
+        <w:t xml:space="preserve">, and switch</w:t>
+      </w:r>
+    </w:p>
+    <w:p>
+      <w:pPr>
+        <w:spacing w:after="140" w:line="276"/>
+      </w:pPr>
+      <w:r>
+        <w:rPr>
+          <w:color w:val="111827"/>
+          <w:sz w:val="21"/>
+          <w:szCs w:val="21"/>
+        </w:rPr>
+        <w:t xml:space="preserve">the dashboard to </w:t>
+      </w:r>
+      <w:r>
+        <w:rPr>
+          <w:b/>
+          <w:bCs/>
+          <w:color w:val="111827"/>
+          <w:sz w:val="21"/>
+          <w:szCs w:val="21"/>
+        </w:rPr>
+        <w:t xml:space="preserve">Test mode</w:t>
+      </w:r>
+      <w:r>
+        <w:rPr>
+          <w:color w:val="111827"/>
+          <w:sz w:val="21"/>
+          <w:szCs w:val="21"/>
+        </w:rPr>
+        <w:t xml:space="preserve">. Test keys are issued immediately, with no verification.</w:t>
+      </w:r>
+    </w:p>
+    <w:p>
+      <w:pPr>
+        <w:pStyle w:val="ListParagraph"/>
+        <w:numPr>
+          <w:ilvl w:val="0"/>
+          <w:numId w:val="2"/>
+        </w:numPr>
+        <w:spacing w:after="60" w:line="264"/>
+      </w:pPr>
+      <w:r>
+        <w:rPr>
+          <w:color w:val="111827"/>
+          <w:sz w:val="21"/>
+          <w:szCs w:val="21"/>
+        </w:rPr>
+        <w:t xml:space="preserve">Generate a webhook secret of your own:</w:t>
       </w:r>
     </w:p>
     <w:p>
@@ -3600,20 +3715,301 @@
           <w:sz w:val="18"/>
           <w:szCs w:val="18"/>
         </w:rPr>
-        <w:t xml:space="preserve">https://bizpilot-api.onrender.com/api/webhooks/flutterwave</w:t>
-      </w:r>
-    </w:p>
-    <w:p>
-      <w:pPr>
-        <w:spacing w:after="140" w:line="276"/>
-      </w:pPr>
-      <w:r>
-        <w:rPr>
-          <w:color w:val="111827"/>
-          <w:sz w:val="21"/>
-          <w:szCs w:val="21"/>
-        </w:rPr>
-        <w:t xml:space="preserve">Use the </w:t>
+        <w:t xml:space="preserve">   node -e "console.log(require('crypto').randomBytes(32).toString('hex'))"</w:t>
+      </w:r>
+    </w:p>
+    <w:p>
+      <w:pPr>
+        <w:pStyle w:val="ListParagraph"/>
+        <w:numPr>
+          <w:ilvl w:val="0"/>
+          <w:numId w:val="2"/>
+        </w:numPr>
+        <w:spacing w:after="60" w:line="264"/>
+      </w:pPr>
+      <w:r>
+        <w:rPr>
+          <w:color w:val="111827"/>
+          <w:sz w:val="21"/>
+          <w:szCs w:val="21"/>
+        </w:rPr>
+        <w:t xml:space="preserve">On </w:t>
+      </w:r>
+      <w:r>
+        <w:rPr>
+          <w:rFonts w:ascii="Consolas" w:cs="Consolas" w:eastAsia="Consolas" w:hAnsi="Consolas"/>
+          <w:color w:val="111827"/>
+          <w:sz w:val="19"/>
+          <w:szCs w:val="19"/>
+        </w:rPr>
+        <w:t xml:space="preserve">bizpilot-api</w:t>
+      </w:r>
+      <w:r>
+        <w:rPr>
+          <w:color w:val="111827"/>
+          <w:sz w:val="21"/>
+          <w:szCs w:val="21"/>
+        </w:rPr>
+        <w:t xml:space="preserve"> → Environment, add three variables:</w:t>
+      </w:r>
+    </w:p>
+    <w:tbl>
+      <w:tblPr>
+        <w:tblW w:type="pct" w:w="100%"/>
+        <w:tblBorders>
+          <w:top w:val="single" w:color="auto" w:sz="4"/>
+          <w:left w:val="single" w:color="auto" w:sz="4"/>
+          <w:bottom w:val="single" w:color="auto" w:sz="4"/>
+          <w:right w:val="single" w:color="auto" w:sz="4"/>
+          <w:insideH w:val="single" w:color="auto" w:sz="4"/>
+          <w:insideV w:val="single" w:color="auto" w:sz="4"/>
+        </w:tblBorders>
+      </w:tblPr>
+      <w:tblGrid>
+        <w:gridCol w:w="100"/>
+        <w:gridCol w:w="100"/>
+      </w:tblGrid>
+      <w:tr>
+        <w:trPr>
+          <w:tblHeader/>
+        </w:trPr>
+        <w:tc>
+          <w:tcPr>
+            <w:shd w:fill="F3F4F6" w:val="clear"/>
+            <w:tcMar>
+              <w:top w:type="dxa" w:w="80"/>
+              <w:left w:type="dxa" w:w="120"/>
+              <w:bottom w:type="dxa" w:w="80"/>
+              <w:right w:type="dxa" w:w="120"/>
+            </w:tcMar>
+          </w:tcPr>
+          <w:p>
+            <w:pPr>
+              <w:spacing w:after="0" w:line="252"/>
+            </w:pPr>
+            <w:r>
+              <w:rPr>
+                <w:b/>
+                <w:bCs/>
+                <w:color w:val="111827"/>
+                <w:sz w:val="19"/>
+                <w:szCs w:val="19"/>
+              </w:rPr>
+              <w:t xml:space="preserve">Key</w:t>
+            </w:r>
+          </w:p>
+        </w:tc>
+        <w:tc>
+          <w:tcPr>
+            <w:shd w:fill="F3F4F6" w:val="clear"/>
+            <w:tcMar>
+              <w:top w:type="dxa" w:w="80"/>
+              <w:left w:type="dxa" w:w="120"/>
+              <w:bottom w:type="dxa" w:w="80"/>
+              <w:right w:type="dxa" w:w="120"/>
+            </w:tcMar>
+          </w:tcPr>
+          <w:p>
+            <w:pPr>
+              <w:spacing w:after="0" w:line="252"/>
+            </w:pPr>
+            <w:r>
+              <w:rPr>
+                <w:b/>
+                <w:bCs/>
+                <w:color w:val="111827"/>
+                <w:sz w:val="19"/>
+                <w:szCs w:val="19"/>
+              </w:rPr>
+              <w:t xml:space="preserve">Value</w:t>
+            </w:r>
+          </w:p>
+        </w:tc>
+      </w:tr>
+      <w:tr>
+        <w:tc>
+          <w:tcPr>
+            <w:tcMar>
+              <w:top w:type="dxa" w:w="80"/>
+              <w:left w:type="dxa" w:w="120"/>
+              <w:bottom w:type="dxa" w:w="80"/>
+              <w:right w:type="dxa" w:w="120"/>
+            </w:tcMar>
+          </w:tcPr>
+          <w:p>
+            <w:pPr>
+              <w:spacing w:after="0" w:line="252"/>
+            </w:pPr>
+            <w:r>
+              <w:rPr>
+                <w:rFonts w:ascii="Consolas" w:cs="Consolas" w:eastAsia="Consolas" w:hAnsi="Consolas"/>
+                <w:b w:val="false"/>
+                <w:bCs w:val="false"/>
+                <w:color w:val="111827"/>
+                <w:sz w:val="19"/>
+                <w:szCs w:val="19"/>
+              </w:rPr>
+              <w:t xml:space="preserve">FLUTTERWAVE_PUBLIC_KEY</w:t>
+            </w:r>
+          </w:p>
+        </w:tc>
+        <w:tc>
+          <w:tcPr>
+            <w:tcMar>
+              <w:top w:type="dxa" w:w="80"/>
+              <w:left w:type="dxa" w:w="120"/>
+              <w:bottom w:type="dxa" w:w="80"/>
+              <w:right w:type="dxa" w:w="120"/>
+            </w:tcMar>
+          </w:tcPr>
+          <w:p>
+            <w:pPr>
+              <w:spacing w:after="0" w:line="252"/>
+            </w:pPr>
+            <w:r>
+              <w:rPr>
+                <w:b w:val="false"/>
+                <w:bCs w:val="false"/>
+                <w:color w:val="111827"/>
+                <w:sz w:val="20"/>
+                <w:szCs w:val="20"/>
+              </w:rPr>
+              <w:t xml:space="preserve">test public key</w:t>
+            </w:r>
+          </w:p>
+        </w:tc>
+      </w:tr>
+      <w:tr>
+        <w:tc>
+          <w:tcPr>
+            <w:tcMar>
+              <w:top w:type="dxa" w:w="80"/>
+              <w:left w:type="dxa" w:w="120"/>
+              <w:bottom w:type="dxa" w:w="80"/>
+              <w:right w:type="dxa" w:w="120"/>
+            </w:tcMar>
+          </w:tcPr>
+          <w:p>
+            <w:pPr>
+              <w:spacing w:after="0" w:line="252"/>
+            </w:pPr>
+            <w:r>
+              <w:rPr>
+                <w:rFonts w:ascii="Consolas" w:cs="Consolas" w:eastAsia="Consolas" w:hAnsi="Consolas"/>
+                <w:b w:val="false"/>
+                <w:bCs w:val="false"/>
+                <w:color w:val="111827"/>
+                <w:sz w:val="19"/>
+                <w:szCs w:val="19"/>
+              </w:rPr>
+              <w:t xml:space="preserve">FLUTTERWAVE_SECRET_KEY</w:t>
+            </w:r>
+          </w:p>
+        </w:tc>
+        <w:tc>
+          <w:tcPr>
+            <w:tcMar>
+              <w:top w:type="dxa" w:w="80"/>
+              <w:left w:type="dxa" w:w="120"/>
+              <w:bottom w:type="dxa" w:w="80"/>
+              <w:right w:type="dxa" w:w="120"/>
+            </w:tcMar>
+          </w:tcPr>
+          <w:p>
+            <w:pPr>
+              <w:spacing w:after="0" w:line="252"/>
+            </w:pPr>
+            <w:r>
+              <w:rPr>
+                <w:b w:val="false"/>
+                <w:bCs w:val="false"/>
+                <w:color w:val="111827"/>
+                <w:sz w:val="20"/>
+                <w:szCs w:val="20"/>
+              </w:rPr>
+              <w:t xml:space="preserve">test secret key</w:t>
+            </w:r>
+          </w:p>
+        </w:tc>
+      </w:tr>
+      <w:tr>
+        <w:tc>
+          <w:tcPr>
+            <w:tcMar>
+              <w:top w:type="dxa" w:w="80"/>
+              <w:left w:type="dxa" w:w="120"/>
+              <w:bottom w:type="dxa" w:w="80"/>
+              <w:right w:type="dxa" w:w="120"/>
+            </w:tcMar>
+          </w:tcPr>
+          <w:p>
+            <w:pPr>
+              <w:spacing w:after="0" w:line="252"/>
+            </w:pPr>
+            <w:r>
+              <w:rPr>
+                <w:rFonts w:ascii="Consolas" w:cs="Consolas" w:eastAsia="Consolas" w:hAnsi="Consolas"/>
+                <w:b w:val="false"/>
+                <w:bCs w:val="false"/>
+                <w:color w:val="111827"/>
+                <w:sz w:val="19"/>
+                <w:szCs w:val="19"/>
+              </w:rPr>
+              <w:t xml:space="preserve">FLUTTERWAVE_WEBHOOK_HASH</w:t>
+            </w:r>
+          </w:p>
+        </w:tc>
+        <w:tc>
+          <w:tcPr>
+            <w:tcMar>
+              <w:top w:type="dxa" w:w="80"/>
+              <w:left w:type="dxa" w:w="120"/>
+              <w:bottom w:type="dxa" w:w="80"/>
+              <w:right w:type="dxa" w:w="120"/>
+            </w:tcMar>
+          </w:tcPr>
+          <w:p>
+            <w:pPr>
+              <w:spacing w:after="0" w:line="252"/>
+            </w:pPr>
+            <w:r>
+              <w:rPr>
+                <w:b w:val="false"/>
+                <w:bCs w:val="false"/>
+                <w:color w:val="111827"/>
+                <w:sz w:val="20"/>
+                <w:szCs w:val="20"/>
+              </w:rPr>
+              <w:t xml:space="preserve">the string from step 2</w:t>
+            </w:r>
+          </w:p>
+        </w:tc>
+      </w:tr>
+    </w:tbl>
+    <w:p>
+      <w:pPr>
+        <w:spacing w:after="160"/>
+      </w:pPr>
+      <w:r>
+        <w:t xml:space="preserve"/>
+      </w:r>
+    </w:p>
+    <w:p>
+      <w:pPr>
+        <w:pStyle w:val="ListParagraph"/>
+        <w:numPr>
+          <w:ilvl w:val="0"/>
+          <w:numId w:val="2"/>
+        </w:numPr>
+        <w:spacing w:after="60" w:line="264"/>
+      </w:pPr>
+      <w:r>
+        <w:rPr>
+          <w:color w:val="111827"/>
+          <w:sz w:val="21"/>
+          <w:szCs w:val="21"/>
+        </w:rPr>
+        <w:t xml:space="preserve">Flutterwave → </w:t>
       </w:r>
       <w:r>
         <w:rPr>
@@ -3623,15 +4019,268 @@
           <w:sz w:val="21"/>
           <w:szCs w:val="21"/>
         </w:rPr>
-        <w:t xml:space="preserve">test</w:t>
-      </w:r>
-      <w:r>
-        <w:rPr>
-          <w:color w:val="111827"/>
-          <w:sz w:val="21"/>
-          <w:szCs w:val="21"/>
-        </w:rPr>
-        <w:t xml:space="preserve"> keys until you have taken a real order end to end.</w:t>
+        <w:t xml:space="preserve">Settings → Webhooks</w:t>
+      </w:r>
+      <w:r>
+        <w:rPr>
+          <w:color w:val="111827"/>
+          <w:sz w:val="21"/>
+          <w:szCs w:val="21"/>
+        </w:rPr>
+        <w:t xml:space="preserve">:</w:t>
+      </w:r>
+    </w:p>
+    <w:p>
+      <w:pPr>
+        <w:pStyle w:val="ListParagraph"/>
+        <w:numPr>
+          <w:ilvl w:val="1"/>
+          <w:numId w:val="1"/>
+        </w:numPr>
+        <w:spacing w:after="60" w:line="264"/>
+      </w:pPr>
+      <w:r>
+        <w:rPr>
+          <w:color w:val="111827"/>
+          <w:sz w:val="21"/>
+          <w:szCs w:val="21"/>
+        </w:rPr>
+        <w:t xml:space="preserve">URL: </w:t>
+      </w:r>
+      <w:r>
+        <w:rPr>
+          <w:rFonts w:ascii="Consolas" w:cs="Consolas" w:eastAsia="Consolas" w:hAnsi="Consolas"/>
+          <w:color w:val="111827"/>
+          <w:sz w:val="19"/>
+          <w:szCs w:val="19"/>
+        </w:rPr>
+        <w:t xml:space="preserve">https://bizpilot-api-si8e.onrender.com/api/webhooks/flutterwave</w:t>
+      </w:r>
+    </w:p>
+    <w:p>
+      <w:pPr>
+        <w:pStyle w:val="ListParagraph"/>
+        <w:numPr>
+          <w:ilvl w:val="1"/>
+          <w:numId w:val="1"/>
+        </w:numPr>
+        <w:spacing w:after="60" w:line="264"/>
+      </w:pPr>
+      <w:r>
+        <w:rPr>
+          <w:color w:val="111827"/>
+          <w:sz w:val="21"/>
+          <w:szCs w:val="21"/>
+        </w:rPr>
+        <w:t xml:space="preserve">Secret hash: </w:t>
+      </w:r>
+      <w:r>
+        <w:rPr>
+          <w:b/>
+          <w:bCs/>
+          <w:color w:val="111827"/>
+          <w:sz w:val="21"/>
+          <w:szCs w:val="21"/>
+        </w:rPr>
+        <w:t xml:space="preserve">the same string as `FLUTTERWAVE_WEBHOOK_HASH`</w:t>
+      </w:r>
+    </w:p>
+    <w:p>
+      <w:pPr>
+        <w:spacing w:after="140" w:line="276"/>
+      </w:pPr>
+      <w:r>
+        <w:rPr>
+          <w:color w:val="111827"/>
+          <w:sz w:val="21"/>
+          <w:szCs w:val="21"/>
+        </w:rPr>
+        <w:t xml:space="preserve">They must match exactly. A missing or wrong hash means every webhook is rejected — which is the correct failure, since an unauthenticated webhook can credit a subscription.</w:t>
+      </w:r>
+    </w:p>
+    <w:p>
+      <w:pPr>
+        <w:pStyle w:val="ListParagraph"/>
+        <w:numPr>
+          <w:ilvl w:val="0"/>
+          <w:numId w:val="2"/>
+        </w:numPr>
+        <w:spacing w:after="60" w:line="264"/>
+      </w:pPr>
+      <w:r>
+        <w:rPr>
+          <w:color w:val="111827"/>
+          <w:sz w:val="21"/>
+          <w:szCs w:val="21"/>
+        </w:rPr>
+        <w:t xml:space="preserve">Confirm it took: </w:t>
+      </w:r>
+      <w:r>
+        <w:rPr>
+          <w:rFonts w:ascii="Consolas" w:cs="Consolas" w:eastAsia="Consolas" w:hAnsi="Consolas"/>
+          <w:color w:val="111827"/>
+          <w:sz w:val="19"/>
+          <w:szCs w:val="19"/>
+        </w:rPr>
+        <w:t xml:space="preserve">paymentsConfigured</w:t>
+      </w:r>
+      <w:r>
+        <w:rPr>
+          <w:color w:val="111827"/>
+          <w:sz w:val="21"/>
+          <w:szCs w:val="21"/>
+        </w:rPr>
+        <w:t xml:space="preserve"> on </w:t>
+      </w:r>
+      <w:r>
+        <w:rPr>
+          <w:rFonts w:ascii="Consolas" w:cs="Consolas" w:eastAsia="Consolas" w:hAnsi="Consolas"/>
+          <w:color w:val="111827"/>
+          <w:sz w:val="19"/>
+          <w:szCs w:val="19"/>
+        </w:rPr>
+        <w:t xml:space="preserve">GET /api/billing</w:t>
+      </w:r>
+      <w:r>
+        <w:rPr>
+          <w:color w:val="111827"/>
+          <w:sz w:val="21"/>
+          <w:szCs w:val="21"/>
+        </w:rPr>
+        <w:t xml:space="preserve"> flips to </w:t>
+      </w:r>
+      <w:r>
+        <w:rPr>
+          <w:rFonts w:ascii="Consolas" w:cs="Consolas" w:eastAsia="Consolas" w:hAnsi="Consolas"/>
+          <w:color w:val="111827"/>
+          <w:sz w:val="19"/>
+          <w:szCs w:val="19"/>
+        </w:rPr>
+        <w:t xml:space="preserve">true</w:t>
+      </w:r>
+      <w:r>
+        <w:rPr>
+          <w:color w:val="111827"/>
+          <w:sz w:val="21"/>
+          <w:szCs w:val="21"/>
+        </w:rPr>
+        <w:t xml:space="preserve">,</w:t>
+      </w:r>
+    </w:p>
+    <w:p>
+      <w:pPr>
+        <w:spacing w:after="140" w:line="276"/>
+      </w:pPr>
+      <w:r>
+        <w:rPr>
+          <w:color w:val="111827"/>
+          <w:sz w:val="21"/>
+          <w:szCs w:val="21"/>
+        </w:rPr>
+        <w:t xml:space="preserve">and the amber warning disappears from Plan &amp; billing.</w:t>
+      </w:r>
+    </w:p>
+    <w:p>
+      <w:pPr>
+        <w:spacing w:after="140" w:line="276"/>
+      </w:pPr>
+      <w:r>
+        <w:rPr>
+          <w:color w:val="111827"/>
+          <w:sz w:val="21"/>
+          <w:szCs w:val="21"/>
+        </w:rPr>
+        <w:t xml:space="preserve">Then send yourself an invoice, open its public link, and pay it with Flutterwave's test credentials. The invoice should move to PAID, the customer's balance drop, and the originating sale settle — all driven by the webhook, not by the browser coming back.</w:t>
+      </w:r>
+    </w:p>
+    <w:p>
+      <w:pPr>
+        <w:pStyle w:val="Heading4"/>
+        <w:spacing w:after="120" w:before="300"/>
+      </w:pPr>
+      <w:r>
+        <w:rPr>
+          <w:b/>
+          <w:bCs/>
+          <w:color w:val="111827"/>
+        </w:rPr>
+        <w:t xml:space="preserve">Going live</w:t>
+      </w:r>
+    </w:p>
+    <w:p>
+      <w:pPr>
+        <w:spacing w:after="140" w:line="276"/>
+      </w:pPr>
+      <w:r>
+        <w:rPr>
+          <w:color w:val="111827"/>
+          <w:sz w:val="21"/>
+          <w:szCs w:val="21"/>
+        </w:rPr>
+        <w:t xml:space="preserve">Live keys need business verification: identity, business registration, and the bank account for settlement. Free to submit, but it takes days and is the real gate — do it well before you need it, not the week you launch.</w:t>
+      </w:r>
+    </w:p>
+    <w:p>
+      <w:pPr>
+        <w:spacing w:after="140" w:line="276"/>
+      </w:pPr>
+      <w:r>
+        <w:rPr>
+          <w:color w:val="111827"/>
+          <w:sz w:val="21"/>
+          <w:szCs w:val="21"/>
+        </w:rPr>
+        <w:t xml:space="preserve">Swap the two keys for the live pair when it clears. Nothing else changes.</w:t>
+      </w:r>
+    </w:p>
+    <w:p>
+      <w:pPr>
+        <w:pBdr>
+          <w:left w:val="single" w:color="0F766E" w:sz="12" w:space="12"/>
+        </w:pBdr>
+        <w:spacing w:after="140" w:line="276"/>
+        <w:ind w:left="360"/>
+      </w:pPr>
+      <w:r>
+        <w:rPr>
+          <w:b/>
+          <w:bCs/>
+          <w:i/>
+          <w:iCs/>
+          <w:color w:val="6B7280"/>
+          <w:sz w:val="21"/>
+          <w:szCs w:val="21"/>
+        </w:rPr>
+        <w:t xml:space="preserve">Do not skip test mode.</w:t>
+      </w:r>
+      <w:r>
+        <w:rPr>
+          <w:i/>
+          <w:iCs/>
+          <w:color w:val="6B7280"/>
+          <w:sz w:val="21"/>
+          <w:szCs w:val="21"/>
+        </w:rPr>
+        <w:t xml:space="preserve"> The settlement path credits plans and clears</w:t>
+      </w:r>
+    </w:p>
+    <w:p>
+      <w:pPr>
+        <w:pBdr>
+          <w:left w:val="single" w:color="0F766E" w:sz="12" w:space="12"/>
+        </w:pBdr>
+        <w:spacing w:after="140" w:line="276"/>
+        <w:ind w:left="360"/>
+      </w:pPr>
+      <w:r>
+        <w:rPr>
+          <w:i/>
+          <w:iCs/>
+          <w:color w:val="6B7280"/>
+          <w:sz w:val="21"/>
+          <w:szCs w:val="21"/>
+        </w:rPr>
+        <w:t xml:space="preserve">customer debts. Watch it work on money that is not real first.</w:t>
       </w:r>
     </w:p>
     <w:p>

</xml_diff>

<commit_message>
Add mail delivery to the pre-launch checklist
DEPLOY.md listed it, the README did not. A reset link that only reaches
the server log is an outage the first time an owner needs it, so it
belongs on the same list as backups and the paid instance.
</commit_message>
<xml_diff>
--- a/docs/word/DEPLOY.docx
+++ b/docs/word/DEPLOY.docx
@@ -29,7 +29,7 @@
           <w:sz w:val="18"/>
           <w:szCs w:val="18"/>
         </w:rPr>
-        <w:t xml:space="preserve">Generated from the repository on 2026-08-17. The markdown source is authoritative.</w:t>
+        <w:t xml:space="preserve">Generated from the repository on 2026-08-18. The markdown source is authoritative.</w:t>
       </w:r>
     </w:p>
     <w:p>
@@ -228,7 +228,7 @@
         </w:rPr>
         <w:t xml:space="preserve">Sign up at </w:t>
       </w:r>
-      <w:hyperlink w:history="1" r:id="rId_iajabw9gij7d1jv7ptw6">
+      <w:hyperlink w:history="1" r:id="rIdvloqfqtsbs8em9txjqngb">
         <w:r>
           <w:rPr>
             <w:rStyle w:val="Hyperlink"/>
@@ -962,7 +962,7 @@
         </w:rPr>
         <w:t xml:space="preserve">Sign up at </w:t>
       </w:r>
-      <w:hyperlink w:history="1" r:id="rIddnziuyiurrnooyf0kxnyk">
+      <w:hyperlink w:history="1" r:id="rId43ueocwo_sdaox597msck">
         <w:r>
           <w:rPr>
             <w:rStyle w:val="Hyperlink"/>
@@ -3528,7 +3528,7 @@
         </w:rPr>
         <w:t xml:space="preserve"> Create a key at </w:t>
       </w:r>
-      <w:hyperlink w:history="1" r:id="rId3szcz6qv57qjcdm3gv9dc">
+      <w:hyperlink w:history="1" r:id="rIdvptvgkx3pqb5se0xkyuhg">
         <w:r>
           <w:rPr>
             <w:rStyle w:val="Hyperlink"/>
@@ -3746,7 +3746,7 @@
         </w:rPr>
         <w:t xml:space="preserve"> The customer types their phone number, MTN pushes an approval prompt to their handset, and the app polls until they approve. This is the flow ~90% of payments in Rwanda actually use. The sandbox at </w:t>
       </w:r>
-      <w:hyperlink w:history="1" r:id="rIdrhheh-ab0mhjx9o7g0ggv">
+      <w:hyperlink w:history="1" r:id="rId9bong51q1vtz-3whjousm">
         <w:r>
           <w:rPr>
             <w:rStyle w:val="Hyperlink"/>

</xml_diff>